<commit_message>
Format IEEE paper with two columns
</commit_message>
<xml_diff>
--- a/docs/RoadSense_AI_Project_Report.docx
+++ b/docs/RoadSense_AI_Project_Report.docx
@@ -115,47 +115,47 @@
     <w:p/>
     <w:p>
       <w:r>
-        <w:t xml:space="preserve">• Severity score</w:t>
-      </w:r>
-    </w:p>
-    <w:p>
-      <w:r>
-        <w:t xml:space="preserve">• Repair priority</w:t>
-      </w:r>
-    </w:p>
-    <w:p>
-      <w:r>
-        <w:t xml:space="preserve">• Estimated repair cost in INR</w:t>
-      </w:r>
-    </w:p>
-    <w:p>
-      <w:r>
-        <w:t xml:space="preserve">• Crew size recommendation</w:t>
-      </w:r>
-    </w:p>
-    <w:p>
-      <w:r>
-        <w:t xml:space="preserve">• SLA response time</w:t>
-      </w:r>
-    </w:p>
-    <w:p>
-      <w:r>
-        <w:t xml:space="preserve">• Risk zone</w:t>
-      </w:r>
-    </w:p>
-    <w:p>
-      <w:r>
-        <w:t xml:space="preserve">• Lane closure requirement</w:t>
-      </w:r>
-    </w:p>
-    <w:p>
-      <w:r>
-        <w:t xml:space="preserve">• SDG alignment</w:t>
-      </w:r>
-    </w:p>
-    <w:p>
-      <w:r>
-        <w:t xml:space="preserve">• Maintenance dispatch note</w:t>
+        <w:t xml:space="preserve">- Severity score</w:t>
+      </w:r>
+    </w:p>
+    <w:p>
+      <w:r>
+        <w:t xml:space="preserve">- Repair priority</w:t>
+      </w:r>
+    </w:p>
+    <w:p>
+      <w:r>
+        <w:t xml:space="preserve">- Estimated repair cost in INR</w:t>
+      </w:r>
+    </w:p>
+    <w:p>
+      <w:r>
+        <w:t xml:space="preserve">- Crew size recommendation</w:t>
+      </w:r>
+    </w:p>
+    <w:p>
+      <w:r>
+        <w:t xml:space="preserve">- SLA response time</w:t>
+      </w:r>
+    </w:p>
+    <w:p>
+      <w:r>
+        <w:t xml:space="preserve">- Risk zone</w:t>
+      </w:r>
+    </w:p>
+    <w:p>
+      <w:r>
+        <w:t xml:space="preserve">- Lane closure requirement</w:t>
+      </w:r>
+    </w:p>
+    <w:p>
+      <w:r>
+        <w:t xml:space="preserve">- SDG alignment</w:t>
+      </w:r>
+    </w:p>
+    <w:p>
+      <w:r>
+        <w:t xml:space="preserve">- Maintenance dispatch note</w:t>
       </w:r>
     </w:p>
     <w:p/>
@@ -182,17 +182,17 @@
     <w:p/>
     <w:p>
       <w:r>
-        <w:t xml:space="preserve">• SDG 3: Good Health and Well-Being, because better road maintenance reduces accident risk.</w:t>
-      </w:r>
-    </w:p>
-    <w:p>
-      <w:r>
-        <w:t xml:space="preserve">• SDG 9: Industry, Innovation and Infrastructure, because the project supports intelligent infrastructure inspection.</w:t>
-      </w:r>
-    </w:p>
-    <w:p>
-      <w:r>
-        <w:t xml:space="preserve">• SDG 11: Sustainable Cities and Communities, because it helps cities maintain safer roads.</w:t>
+        <w:t xml:space="preserve">- SDG 3: Good Health and Well-Being, because better road maintenance reduces accident risk.</w:t>
+      </w:r>
+    </w:p>
+    <w:p>
+      <w:r>
+        <w:t xml:space="preserve">- SDG 9: Industry, Innovation and Infrastructure, because the project supports intelligent infrastructure inspection.</w:t>
+      </w:r>
+    </w:p>
+    <w:p>
+      <w:r>
+        <w:t xml:space="preserve">- SDG 11: Sustainable Cities and Communities, because it helps cities maintain safer roads.</w:t>
       </w:r>
     </w:p>
     <w:p/>
@@ -894,7 +894,7 @@
     </w:p>
     <w:sectPr>
       <w:pgSz w:w="12240" w:h="15840"/>
-      <w:pgMar w:top="1440" w:right="1440" w:bottom="1440" w:left="1440"/>
+      <w:pgMar w:top="720" w:right="720" w:bottom="720" w:left="720"/>
     </w:sectPr>
   </w:body>
 </w:document>

</xml_diff>